<commit_message>
chore(examples): regenerate from the fixed rendering profile
Closes the follow-up left open by #85 and #86. The committed artifacts were built
under the author's inherited local settings; #86 made build_examples.py render
from a complete, fixed profile so the documented command reproduces them on any
machine. This is that one regeneration, now that both changes are on main.

Verified: math-cheatsheet keeps the transpose and blackboard-bold fixes from #85,
no literal LaTeX commands survive, and no chat artifacts remain.
</commit_message>
<xml_diff>
--- a/examples/chatgpt-export.docx
+++ b/examples/chatgpt-export.docx
@@ -152,7 +152,7 @@
             </mc:Choice>
           </mc:AlternateContent>
         </w:rPr>
-        <w:t xml:space="preserve">direction that reduces it fastest - the negative gradient. Each update looks like:</w:t>
+        <w:t xml:space="preserve">direction that reduces it fastest — the negative gradient. Each update looks like:</w:t>
       </w:r>
     </w:p>
     <w:p>
@@ -1054,16 +1054,10 @@
       </w:pPr>
     </w:p>
     <w:sectPr>
-      <w:headerReference xmlns:r="http://schemas.openxmlformats.org/officeDocument/2006/relationships" w:type="default" r:id="Rc8c9bddec3264fa4"/>
-      <w:footerReference xmlns:r="http://schemas.openxmlformats.org/officeDocument/2006/relationships" w:type="default" r:id="R0fe39ba4f3c54a0d"/>
+      <w:headerReference xmlns:r="http://schemas.openxmlformats.org/officeDocument/2006/relationships" w:type="default" r:id="R239e6f9aeee74201"/>
+      <w:footerReference xmlns:r="http://schemas.openxmlformats.org/officeDocument/2006/relationships" w:type="default" r:id="Rcbefc4144fd440e1"/>
       <w:pgSz w:w="11906" w:h="16838"/>
       <w:pgMar w:top="1440" w:right="1440" w:bottom="1440" w:left="1440" w:header="576" w:footer="576" w:gutter="0"/>
-      <w:pgBorders w:display="allPages" w:offsetFrom="page">
-        <w:top w:val="single" w:color="D1D5DA" w:sz="8" w:space="24"/>
-        <w:left w:val="single" w:color="D1D5DA" w:sz="8" w:space="24"/>
-        <w:bottom w:val="single" w:color="D1D5DA" w:sz="8" w:space="24"/>
-        <w:right w:val="single" w:color="D1D5DA" w:sz="8" w:space="24"/>
-      </w:pgBorders>
     </w:sectPr>
   </w:body>
 </w:document>
@@ -1323,7 +1317,7 @@
   <w:docDefaults>
     <w:rPrDefault>
       <w:rPr>
-        <w:rFonts w:ascii="-apple-system-body, ui-sans-serif, -apple-system, &quot;system-ui&quot;, &quot;Segoe UI&quot;, Helvetica, &quot;Apple Color Emoji&quot;, Arial, &quot;sans-serif&quot;, &quot;Segoe UI Emoji&quot;, &quot;Segoe UI Symbol&quot;" w:hAnsi="-apple-system-body, ui-sans-serif, -apple-system, &quot;system-ui&quot;, &quot;Segoe UI&quot;, Helvetica, &quot;Apple Color Emoji&quot;, Arial, &quot;sans-serif&quot;, &quot;Segoe UI Emoji&quot;, &quot;Segoe UI Symbol&quot;" w:eastAsia="-apple-system-body, ui-sans-serif, -apple-system, &quot;system-ui&quot;, &quot;Segoe UI&quot;, Helvetica, &quot;Apple Color Emoji&quot;, Arial, &quot;sans-serif&quot;, &quot;Segoe UI Emoji&quot;, &quot;Segoe UI Symbol&quot;" w:cs="-apple-system-body, ui-sans-serif, -apple-system, &quot;system-ui&quot;, &quot;Segoe UI&quot;, Helvetica, &quot;Apple Color Emoji&quot;, Arial, &quot;sans-serif&quot;, &quot;Segoe UI Emoji&quot;, &quot;Segoe UI Symbol&quot;"/>
+        <w:rFonts w:ascii="Segoe UI Variable" w:hAnsi="Segoe UI Variable" w:eastAsia="Segoe UI Variable" w:cs="Segoe UI Variable"/>
         <w:color w:val="1b1f23"/>
         <w:kern w:val="16"/>
         <w:sz w:val="22"/>
@@ -1481,7 +1475,7 @@
 </file>
 
 <file path=customXml/item.xml><?xml version="1.0" encoding="utf-8"?>
-<marksmithSource schema="marksmith-source-v1" version="1.0.0.0" exportedUtc="2026-08-29T17:55:11.7762722Z" theme="GitHub Light" mermaidMode="1">
+<marksmithSource schema="marksmith-source-v1" version="1.0.0.0" exportedUtc="2026-08-30T02:47:02.5103598Z" theme="GitHub Light" mermaidMode="1">
   <markdown><![CDATA[# Understanding Gradient Descent
 Great question! Here's a clear walkthrough of how gradient descent actually works .
 **The core idea:** we want to minimise a loss function $ L(\theta) $ by repeatedly stepping in the

</xml_diff>

<commit_message>
chore(examples): regenerate from the fixed rendering profile (#90)
Closes the follow-up left open by #85 and #86. The committed artifacts were built
under the author's inherited local settings; #86 made build_examples.py render
from a complete, fixed profile so the documented command reproduces them on any
machine. This is that one regeneration, now that both changes are on main.

Verified: math-cheatsheet keeps the transpose and blackboard-bold fixes from #85,
no literal LaTeX commands survive, and no chat artifacts remain.

Co-authored-by: AI Bot <bot@example.com>
</commit_message>
<xml_diff>
--- a/examples/chatgpt-export.docx
+++ b/examples/chatgpt-export.docx
@@ -152,7 +152,7 @@
             </mc:Choice>
           </mc:AlternateContent>
         </w:rPr>
-        <w:t xml:space="preserve">direction that reduces it fastest - the negative gradient. Each update looks like:</w:t>
+        <w:t xml:space="preserve">direction that reduces it fastest — the negative gradient. Each update looks like:</w:t>
       </w:r>
     </w:p>
     <w:p>
@@ -1054,16 +1054,10 @@
       </w:pPr>
     </w:p>
     <w:sectPr>
-      <w:headerReference xmlns:r="http://schemas.openxmlformats.org/officeDocument/2006/relationships" w:type="default" r:id="Rc8c9bddec3264fa4"/>
-      <w:footerReference xmlns:r="http://schemas.openxmlformats.org/officeDocument/2006/relationships" w:type="default" r:id="R0fe39ba4f3c54a0d"/>
+      <w:headerReference xmlns:r="http://schemas.openxmlformats.org/officeDocument/2006/relationships" w:type="default" r:id="R239e6f9aeee74201"/>
+      <w:footerReference xmlns:r="http://schemas.openxmlformats.org/officeDocument/2006/relationships" w:type="default" r:id="Rcbefc4144fd440e1"/>
       <w:pgSz w:w="11906" w:h="16838"/>
       <w:pgMar w:top="1440" w:right="1440" w:bottom="1440" w:left="1440" w:header="576" w:footer="576" w:gutter="0"/>
-      <w:pgBorders w:display="allPages" w:offsetFrom="page">
-        <w:top w:val="single" w:color="D1D5DA" w:sz="8" w:space="24"/>
-        <w:left w:val="single" w:color="D1D5DA" w:sz="8" w:space="24"/>
-        <w:bottom w:val="single" w:color="D1D5DA" w:sz="8" w:space="24"/>
-        <w:right w:val="single" w:color="D1D5DA" w:sz="8" w:space="24"/>
-      </w:pgBorders>
     </w:sectPr>
   </w:body>
 </w:document>
@@ -1323,7 +1317,7 @@
   <w:docDefaults>
     <w:rPrDefault>
       <w:rPr>
-        <w:rFonts w:ascii="-apple-system-body, ui-sans-serif, -apple-system, &quot;system-ui&quot;, &quot;Segoe UI&quot;, Helvetica, &quot;Apple Color Emoji&quot;, Arial, &quot;sans-serif&quot;, &quot;Segoe UI Emoji&quot;, &quot;Segoe UI Symbol&quot;" w:hAnsi="-apple-system-body, ui-sans-serif, -apple-system, &quot;system-ui&quot;, &quot;Segoe UI&quot;, Helvetica, &quot;Apple Color Emoji&quot;, Arial, &quot;sans-serif&quot;, &quot;Segoe UI Emoji&quot;, &quot;Segoe UI Symbol&quot;" w:eastAsia="-apple-system-body, ui-sans-serif, -apple-system, &quot;system-ui&quot;, &quot;Segoe UI&quot;, Helvetica, &quot;Apple Color Emoji&quot;, Arial, &quot;sans-serif&quot;, &quot;Segoe UI Emoji&quot;, &quot;Segoe UI Symbol&quot;" w:cs="-apple-system-body, ui-sans-serif, -apple-system, &quot;system-ui&quot;, &quot;Segoe UI&quot;, Helvetica, &quot;Apple Color Emoji&quot;, Arial, &quot;sans-serif&quot;, &quot;Segoe UI Emoji&quot;, &quot;Segoe UI Symbol&quot;"/>
+        <w:rFonts w:ascii="Segoe UI Variable" w:hAnsi="Segoe UI Variable" w:eastAsia="Segoe UI Variable" w:cs="Segoe UI Variable"/>
         <w:color w:val="1b1f23"/>
         <w:kern w:val="16"/>
         <w:sz w:val="22"/>
@@ -1481,7 +1475,7 @@
 </file>
 
 <file path=customXml/item.xml><?xml version="1.0" encoding="utf-8"?>
-<marksmithSource schema="marksmith-source-v1" version="1.0.0.0" exportedUtc="2026-08-29T17:55:11.7762722Z" theme="GitHub Light" mermaidMode="1">
+<marksmithSource schema="marksmith-source-v1" version="1.0.0.0" exportedUtc="2026-08-30T02:47:02.5103598Z" theme="GitHub Light" mermaidMode="1">
   <markdown><![CDATA[# Understanding Gradient Descent
 Great question! Here's a clear walkthrough of how gradient descent actually works .
 **The core idea:** we want to minimise a loss function $ L(\theta) $ by repeatedly stepping in the

</xml_diff>